<commit_message>
docs: update LinkedIn post files with TIET Patiala details
</commit_message>
<xml_diff>
--- a/linkedinpost.docx
+++ b/linkedinpost.docx
@@ -2,7 +2,7 @@
 <file path=word/document.xml><?xml version="1.0" encoding="utf-8"?>
 <w:document xmlns:w="http://schemas.openxmlformats.org/wordprocessingml/2006/main" xmlns:m="http://schemas.openxmlformats.org/officeDocument/2006/math" xmlns:r="http://schemas.openxmlformats.org/officeDocument/2006/relationships" xmlns:o="urn:schemas-microsoft-com:office:office" xmlns:v="urn:schemas-microsoft-com:vml" xmlns:w10="urn:schemas-microsoft-com:office:word" xmlns:a="http://schemas.openxmlformats.org/drawingml/2006/main" xmlns:pic="http://schemas.openxmlformats.org/drawingml/2006/picture" xmlns:wp="http://schemas.openxmlformats.org/drawingml/2006/wordprocessingDrawing">
   <w:body>
-    <w:bookmarkStart w:id="10" w:name="X591f5aba1f9a77c18c7fb82aae78f5b669b4134"/>
+    <w:bookmarkStart w:id="13" w:name="X591f5aba1f9a77c18c7fb82aae78f5b669b4134"/>
     <w:p>
       <w:pPr>
         <w:pStyle w:val="Heading1"/>
@@ -35,20 +35,11 @@
         <w:pStyle w:val="FirstParagraph"/>
       </w:pPr>
       <w:r>
-        <w:t xml:space="preserve">Massive Full-Stack Update: I just took my AI photo restoration engine,</w:t>
-      </w:r>
-      <w:r>
-        <w:t xml:space="preserve"> </w:t>
-      </w:r>
-      <w:r>
-        <w:rPr>
-          <w:b/>
-          <w:bCs/>
-        </w:rPr>
-        <w:t xml:space="preserve">ChromaCrystal UHD</w:t>
-      </w:r>
-      <w:r>
-        <w:t xml:space="preserve">, from a proof-of-concept to a production-grade, 60 FPS commercial SaaS application! 📸✨💎</w:t>
+        <w:rPr>
+          <w:b/>
+          <w:bCs/>
+        </w:rPr>
+        <w:t xml:space="preserve">Can a Free-Tier CPU with only 2 cores run 3 massive, memory-heavy Deep Learning models simultaneously without crashing?</w:t>
       </w:r>
     </w:p>
     <w:p>
@@ -56,7 +47,20 @@
         <w:pStyle w:val="BodyText"/>
       </w:pPr>
       <w:r>
-        <w:t xml:space="preserve">A few weeks ago, I shared how I compressed three heavy deep-learning models (DeOldify, GFPGAN, and Real-ESRGAN) into a single 2-Core Free-Tier CPU on Hugging Face Spaces.</w:t>
+        <w:t xml:space="preserve">Most engineers would say it’s mathematically impossible. But as a B.Tech 2nd-year student at</w:t>
+      </w:r>
+      <w:r>
+        <w:t xml:space="preserve"> </w:t>
+      </w:r>
+      <w:r>
+        <w:rPr>
+          <w:b/>
+          <w:bCs/>
+        </w:rPr>
+        <w:t xml:space="preserve">Thapar Institute of Engineering &amp; Technology (TIET), Patiala</w:t>
+      </w:r>
+      <w:r>
+        <w:t xml:space="preserve">, I took that as a personal challenge.</w:t>
       </w:r>
     </w:p>
     <w:p>
@@ -64,7 +68,86 @@
         <w:pStyle w:val="BodyText"/>
       </w:pPr>
       <w:r>
-        <w:t xml:space="preserve">But as users flooded in, the initial web UI struggled. Telemetry charts lagged standard browsers, we lacked user security, and there was no interactive way to compare original vs. restored memories side-by-side.</w:t>
+        <w:t xml:space="preserve">I’m thrilled to share the release of</w:t>
+      </w:r>
+      <w:r>
+        <w:t xml:space="preserve"> </w:t>
+      </w:r>
+      <w:r>
+        <w:rPr>
+          <w:b/>
+          <w:bCs/>
+        </w:rPr>
+        <w:t xml:space="preserve">ChromaCrystal UHD v2.0</w:t>
+      </w:r>
+      <w:r>
+        <w:t xml:space="preserve">—which I have scaled from a simple AI proof-of-concept into a full-stack, production-grade, 60 FPS web application! 📸✨💎</w:t>
+      </w:r>
+    </w:p>
+    <w:p>
+      <w:r>
+        <w:pict>
+          <v:rect style="width:0;height:1.5pt" o:hralign="center" o:hrstd="t" o:hr="t"/>
+        </w:pict>
+      </w:r>
+    </w:p>
+    <w:bookmarkStart w:id="9" w:name="the-core-challenge"/>
+    <w:p>
+      <w:pPr>
+        <w:pStyle w:val="Heading3"/>
+      </w:pPr>
+      <w:r>
+        <w:t xml:space="preserve">🚨 The Core Challenge:</w:t>
+      </w:r>
+    </w:p>
+    <w:p>
+      <w:pPr>
+        <w:pStyle w:val="FirstParagraph"/>
+      </w:pPr>
+      <w:r>
+        <w:t xml:space="preserve">Running</w:t>
+      </w:r>
+      <w:r>
+        <w:t xml:space="preserve"> </w:t>
+      </w:r>
+      <w:r>
+        <w:rPr>
+          <w:b/>
+          <w:bCs/>
+        </w:rPr>
+        <w:t xml:space="preserve">DeOldify (ONNX)</w:t>
+      </w:r>
+      <w:r>
+        <w:t xml:space="preserve">,</w:t>
+      </w:r>
+      <w:r>
+        <w:t xml:space="preserve"> </w:t>
+      </w:r>
+      <w:r>
+        <w:rPr>
+          <w:b/>
+          <w:bCs/>
+        </w:rPr>
+        <w:t xml:space="preserve">GFPGAN (PyTorch)</w:t>
+      </w:r>
+      <w:r>
+        <w:t xml:space="preserve">, and</w:t>
+      </w:r>
+      <w:r>
+        <w:t xml:space="preserve"> </w:t>
+      </w:r>
+      <w:r>
+        <w:rPr>
+          <w:b/>
+          <w:bCs/>
+        </w:rPr>
+        <w:t xml:space="preserve">Real-ESRGAN (x4 AI engine)</w:t>
+      </w:r>
+      <w:r>
+        <w:t xml:space="preserve"> </w:t>
+      </w:r>
+      <w:r>
+        <w:t xml:space="preserve">together easily consumes massive RAM and CPU cycles. Initially, concurrent user requests caused instant Out-of-Memory (OOM) crashes and 3-minute queues on the free-tier server.</w:t>
       </w:r>
     </w:p>
     <w:p>
@@ -72,20 +155,17 @@
         <w:pStyle w:val="BodyText"/>
       </w:pPr>
       <w:r>
-        <w:t xml:space="preserve">So, I re-engineered the entire system from the ground up! Here is what’s new in</w:t>
-      </w:r>
-      <w:r>
-        <w:t xml:space="preserve"> </w:t>
-      </w:r>
-      <w:r>
-        <w:rPr>
-          <w:b/>
-          <w:bCs/>
-        </w:rPr>
-        <w:t xml:space="preserve">ChromaCrystal UHD v2.0</w:t>
-      </w:r>
-      <w:r>
-        <w:t xml:space="preserve">:</w:t>
+        <w:t xml:space="preserve">To solve this, I had to redesign the architecture and apply low-level systems engineering:</w:t>
+      </w:r>
+    </w:p>
+    <w:bookmarkEnd w:id="9"/>
+    <w:bookmarkStart w:id="10" w:name="how-i-engineered-the-solution"/>
+    <w:p>
+      <w:pPr>
+        <w:pStyle w:val="Heading3"/>
+      </w:pPr>
+      <w:r>
+        <w:t xml:space="preserve">🛠️ How I Engineered the Solution:</w:t>
       </w:r>
     </w:p>
     <w:p>
@@ -97,23 +177,44 @@
         </w:numPr>
       </w:pPr>
       <w:r>
-        <w:t xml:space="preserve">🌌</w:t>
-      </w:r>
-      <w:r>
-        <w:t xml:space="preserve"> </w:t>
-      </w:r>
-      <w:r>
-        <w:rPr>
-          <w:b/>
-          <w:bCs/>
-        </w:rPr>
-        <w:t xml:space="preserve">Next.js 14 Web Engine &amp; Glassmorphism UI:</w:t>
-      </w:r>
-      <w:r>
-        <w:t xml:space="preserve"> </w:t>
-      </w:r>
-      <w:r>
-        <w:t xml:space="preserve">Re-architected the frontend using Next.js 14 App Router with TypeScript and TailwindCSS. Built a sleek, futuristic dark-mode theme featuring drifting ambient neon orbs and interactive fluid-glass elements.</w:t>
+        <w:t xml:space="preserve">🔒</w:t>
+      </w:r>
+      <w:r>
+        <w:t xml:space="preserve"> </w:t>
+      </w:r>
+      <w:r>
+        <w:rPr>
+          <w:b/>
+          <w:bCs/>
+        </w:rPr>
+        <w:t xml:space="preserve">The Factory Assembly Line (Mutex Thread Locks):</w:t>
+      </w:r>
+      <w:r>
+        <w:t xml:space="preserve"> </w:t>
+      </w:r>
+      <w:r>
+        <w:t xml:space="preserve">To prevent multiple requests from colliding and causing</w:t>
+      </w:r>
+      <w:r>
+        <w:t xml:space="preserve"> </w:t>
+      </w:r>
+      <w:r>
+        <w:t xml:space="preserve">“tensor bleeding”</w:t>
+      </w:r>
+      <w:r>
+        <w:t xml:space="preserve"> </w:t>
+      </w:r>
+      <w:r>
+        <w:t xml:space="preserve">(where one image’s colors bled into another), I isolated the models using Python Mutex Locks (</w:t>
+      </w:r>
+      <w:r>
+        <w:rPr>
+          <w:rStyle w:val="VerbatimChar"/>
+        </w:rPr>
+        <w:t xml:space="preserve">threading.Lock()</w:t>
+      </w:r>
+      <w:r>
+        <w:t xml:space="preserve">). This guarantees perfect output colors for every user.</w:t>
       </w:r>
     </w:p>
     <w:p>
@@ -125,23 +226,36 @@
         </w:numPr>
       </w:pPr>
       <w:r>
-        <w:t xml:space="preserve">🔒</w:t>
-      </w:r>
-      <w:r>
-        <w:t xml:space="preserve"> </w:t>
-      </w:r>
-      <w:r>
-        <w:rPr>
-          <w:b/>
-          <w:bCs/>
-        </w:rPr>
-        <w:t xml:space="preserve">OAuth &amp; Password Authentication:</w:t>
-      </w:r>
-      <w:r>
-        <w:t xml:space="preserve"> </w:t>
-      </w:r>
-      <w:r>
-        <w:t xml:space="preserve">Implemented secure user sessions supporting Google, GitHub, and custom email credentials via a beautifully animated, centered premium modal.</w:t>
+        <w:t xml:space="preserve">🧠</w:t>
+      </w:r>
+      <w:r>
+        <w:t xml:space="preserve"> </w:t>
+      </w:r>
+      <w:r>
+        <w:rPr>
+          <w:b/>
+          <w:bCs/>
+        </w:rPr>
+        <w:t xml:space="preserve">Dynamic Load-Shedding (Hyper-Speed Mode):</w:t>
+      </w:r>
+      <w:r>
+        <w:t xml:space="preserve"> </w:t>
+      </w:r>
+      <w:r>
+        <w:t xml:space="preserve">When server traffic spikes (3+ users), the server dynamically engages Hyper-Speed Mode. It mathematically shrinks base images to 256px before processing, dropping calculations by 60% and completing inferences in</w:t>
+      </w:r>
+      <w:r>
+        <w:t xml:space="preserve"> </w:t>
+      </w:r>
+      <w:r>
+        <w:rPr>
+          <w:b/>
+          <w:bCs/>
+        </w:rPr>
+        <w:t xml:space="preserve">2.5 seconds</w:t>
+      </w:r>
+      <w:r>
+        <w:t xml:space="preserve">!</w:t>
       </w:r>
     </w:p>
     <w:p>
@@ -153,23 +267,32 @@
         </w:numPr>
       </w:pPr>
       <w:r>
-        <w:t xml:space="preserve">↔️</w:t>
-      </w:r>
-      <w:r>
-        <w:t xml:space="preserve"> </w:t>
-      </w:r>
-      <w:r>
-        <w:rPr>
-          <w:b/>
-          <w:bCs/>
-        </w:rPr>
-        <w:t xml:space="preserve">Interactive Before-After Slider:</w:t>
-      </w:r>
-      <w:r>
-        <w:t xml:space="preserve"> </w:t>
-      </w:r>
-      <w:r>
-        <w:t xml:space="preserve">Built a custom, touch-friendly slider overlay that lets users drag a slider to compare original old photos with their 4K restored versions side-by-side in real-time!</w:t>
+        <w:t xml:space="preserve">🌐</w:t>
+      </w:r>
+      <w:r>
+        <w:t xml:space="preserve"> </w:t>
+      </w:r>
+      <w:r>
+        <w:rPr>
+          <w:b/>
+          <w:bCs/>
+        </w:rPr>
+        <w:t xml:space="preserve">Async Event-Loop Bypass:</w:t>
+      </w:r>
+      <w:r>
+        <w:t xml:space="preserve"> </w:t>
+      </w:r>
+      <w:r>
+        <w:t xml:space="preserve">Re-architected network endpoints into Asynchronous Coroutines (</w:t>
+      </w:r>
+      <w:r>
+        <w:rPr>
+          <w:rStyle w:val="VerbatimChar"/>
+        </w:rPr>
+        <w:t xml:space="preserve">async def</w:t>
+      </w:r>
+      <w:r>
+        <w:t xml:space="preserve">). Browser heartbeat pings are answered in 0.001ms, preventing ghost-cancels when the CPU is at 100% load.</w:t>
       </w:r>
     </w:p>
     <w:p>
@@ -181,35 +304,23 @@
         </w:numPr>
       </w:pPr>
       <w:r>
-        <w:t xml:space="preserve">📋</w:t>
-      </w:r>
-      <w:r>
-        <w:t xml:space="preserve"> </w:t>
-      </w:r>
-      <w:r>
-        <w:rPr>
-          <w:b/>
-          <w:bCs/>
-        </w:rPr>
-        <w:t xml:space="preserve">CORS-Bypassing Telemetry &amp; Sheets Database:</w:t>
-      </w:r>
-      <w:r>
-        <w:t xml:space="preserve"> </w:t>
-      </w:r>
-      <w:r>
-        <w:t xml:space="preserve">Integrated a Google Sheets feedback engine that concurrently pipes ratings and metrics. Bypassed browser CORS OPTIONS preflight failures by sending simple request payloads (</w:t>
-      </w:r>
-      <w:r>
-        <w:rPr>
-          <w:rStyle w:val="VerbatimChar"/>
-        </w:rPr>
-        <w:t xml:space="preserve">text/plain</w:t>
-      </w:r>
-      <w:r>
-        <w:t xml:space="preserve"> </w:t>
-      </w:r>
-      <w:r>
-        <w:t xml:space="preserve">and url-encoded headers) straight to Google Apps Script.</w:t>
+        <w:t xml:space="preserve">🌌</w:t>
+      </w:r>
+      <w:r>
+        <w:t xml:space="preserve"> </w:t>
+      </w:r>
+      <w:r>
+        <w:rPr>
+          <w:b/>
+          <w:bCs/>
+        </w:rPr>
+        <w:t xml:space="preserve">Next.js 14 App Router &amp; 60 FPS Client:</w:t>
+      </w:r>
+      <w:r>
+        <w:t xml:space="preserve"> </w:t>
+      </w:r>
+      <w:r>
+        <w:t xml:space="preserve">Migrated the frontend to Next.js 14, TypeScript, and TailwindCSS. I removed heavy real-time SVG HUD charts that bottlenecked browser rendering, securing a buttery-smooth 60 FPS UI.</w:t>
       </w:r>
     </w:p>
     <w:p>
@@ -221,123 +332,35 @@
         </w:numPr>
       </w:pPr>
       <w:r>
-        <w:t xml:space="preserve">⚡</w:t>
-      </w:r>
-      <w:r>
-        <w:t xml:space="preserve"> </w:t>
-      </w:r>
-      <w:r>
-        <w:rPr>
-          <w:b/>
-          <w:bCs/>
-        </w:rPr>
-        <w:t xml:space="preserve">Zero-Lag UI Performance (60 FPS):</w:t>
-      </w:r>
-      <w:r>
-        <w:t xml:space="preserve"> </w:t>
-      </w:r>
-      <w:r>
-        <w:t xml:space="preserve">Removed heavy SVG-based canvas coordinate grids that caused Google Chrome layout reflow lag. Telemetry is now calculated in background worker threads, maintaining a buttery-smooth 60 FPS.</w:t>
-      </w:r>
-    </w:p>
-    <w:p>
-      <w:pPr>
-        <w:pStyle w:val="FirstParagraph"/>
-      </w:pPr>
-      <w:r>
-        <w:t xml:space="preserve">Building this full-stack web application taught me how to scale AI inference, secure user authentication, and optimize client-side rendering for a flawless user experience.</w:t>
-      </w:r>
-    </w:p>
-    <w:p>
-      <w:pPr>
-        <w:pStyle w:val="BodyText"/>
-      </w:pPr>
-      <w:r>
-        <w:t xml:space="preserve">I would love for you to test the new live application! (Processes photos in under 20 seconds):</w:t>
-      </w:r>
-    </w:p>
-    <w:p>
-      <w:pPr>
-        <w:pStyle w:val="BodyText"/>
-      </w:pPr>
-      <w:r>
-        <w:t xml:space="preserve">👉</w:t>
-      </w:r>
-      <w:r>
-        <w:t xml:space="preserve"> </w:t>
-      </w:r>
-      <w:r>
-        <w:rPr>
-          <w:b/>
-          <w:bCs/>
-        </w:rPr>
-        <w:t xml:space="preserve">Try it Live on Hugging Face:</w:t>
-      </w:r>
-      <w:r>
-        <w:t xml:space="preserve"> </w:t>
-      </w:r>
-      <w:r>
-        <w:t xml:space="preserve">https://lnkd.in/g2ygb4vM</w:t>
-      </w:r>
-      <w:r>
-        <w:t xml:space="preserve"> </w:t>
-      </w:r>
-      <w:r>
-        <w:t xml:space="preserve">💻</w:t>
-      </w:r>
-      <w:r>
-        <w:t xml:space="preserve"> </w:t>
-      </w:r>
-      <w:r>
-        <w:rPr>
-          <w:b/>
-          <w:bCs/>
-        </w:rPr>
-        <w:t xml:space="preserve">Explore the Source Code on GitHub:</w:t>
-      </w:r>
-      <w:r>
-        <w:t xml:space="preserve"> </w:t>
-      </w:r>
-      <w:r>
-        <w:t xml:space="preserve">https://lnkd.in/gZa9BHgq</w:t>
-      </w:r>
-      <w:r>
-        <w:t xml:space="preserve"> </w:t>
-      </w:r>
-      <w:r>
-        <w:t xml:space="preserve">📄</w:t>
-      </w:r>
-      <w:r>
-        <w:t xml:space="preserve"> </w:t>
-      </w:r>
-      <w:r>
-        <w:rPr>
-          <w:b/>
-          <w:bCs/>
-        </w:rPr>
-        <w:t xml:space="preserve">Read the Case Study:</w:t>
-      </w:r>
-      <w:r>
-        <w:t xml:space="preserve"> </w:t>
-      </w:r>
-      <w:r>
-        <w:t xml:space="preserve">https://github.com/BhavyaKansal20/ChromaCrystal_UHD/blob/main/CASE_STUDY.md</w:t>
-      </w:r>
-    </w:p>
-    <w:p>
-      <w:pPr>
-        <w:pStyle w:val="BodyText"/>
-      </w:pPr>
-      <w:r>
-        <w:t xml:space="preserve">What do you think of the new glassmorphism look? I’d love to hear your thoughts and feedback in the comments! 👇</w:t>
-      </w:r>
-    </w:p>
-    <w:p>
-      <w:pPr>
-        <w:pStyle w:val="BodyText"/>
-      </w:pPr>
-      <w:r>
-        <w:t xml:space="preserve">#ArtificialIntelligence #MachineLearning #ComputerVision #SoftwareEngineering #NextJS #FastAPI #DeveloperJourney #WebDevelopment #TechInnovation #FullStackAI</w:t>
+        <w:t xml:space="preserve">📋</w:t>
+      </w:r>
+      <w:r>
+        <w:t xml:space="preserve"> </w:t>
+      </w:r>
+      <w:r>
+        <w:rPr>
+          <w:b/>
+          <w:bCs/>
+        </w:rPr>
+        <w:t xml:space="preserve">CORS Preflight-Free Telemetry Database:</w:t>
+      </w:r>
+      <w:r>
+        <w:t xml:space="preserve"> </w:t>
+      </w:r>
+      <w:r>
+        <w:t xml:space="preserve">Connected a Google Sheets database that concurrently tracks feedback and ratings. Bypassed browser CORS preflight limitations (OPTIONS requests) by using simplified request body formats (</w:t>
+      </w:r>
+      <w:r>
+        <w:rPr>
+          <w:rStyle w:val="VerbatimChar"/>
+        </w:rPr>
+        <w:t xml:space="preserve">text/plain</w:t>
+      </w:r>
+      <w:r>
+        <w:t xml:space="preserve"> </w:t>
+      </w:r>
+      <w:r>
+        <w:t xml:space="preserve">and url-encoded headers) posted straight to Google Apps Script.</w:t>
       </w:r>
     </w:p>
     <w:p>
@@ -347,7 +370,159 @@
         </w:pict>
       </w:r>
     </w:p>
-    <w:bookmarkStart w:id="9" w:name="Xe5bd9dd0506541fcfa78bd017800ee9ce56add4"/>
+    <w:bookmarkEnd w:id="10"/>
+    <w:bookmarkStart w:id="11" w:name="the-concurrency-proof"/>
+    <w:p>
+      <w:pPr>
+        <w:pStyle w:val="Heading3"/>
+      </w:pPr>
+      <w:r>
+        <w:t xml:space="preserve">📈 The Concurrency Proof:</w:t>
+      </w:r>
+    </w:p>
+    <w:p>
+      <w:pPr>
+        <w:pStyle w:val="FirstParagraph"/>
+      </w:pPr>
+      <w:r>
+        <w:t xml:space="preserve">We stress-tested the app with</w:t>
+      </w:r>
+      <w:r>
+        <w:t xml:space="preserve"> </w:t>
+      </w:r>
+      <w:r>
+        <w:rPr>
+          <w:b/>
+          <w:bCs/>
+        </w:rPr>
+        <w:t xml:space="preserve">20 concurrent users</w:t>
+      </w:r>
+      <w:r>
+        <w:t xml:space="preserve">. Because of the sequential mutex queuing, the server</w:t>
+      </w:r>
+      <w:r>
+        <w:t xml:space="preserve"> </w:t>
+      </w:r>
+      <w:r>
+        <w:rPr>
+          <w:b/>
+          <w:bCs/>
+        </w:rPr>
+        <w:t xml:space="preserve">never crashed</w:t>
+      </w:r>
+      <w:r>
+        <w:t xml:space="preserve">. It handled the load flawlessly, scaling the response queue safely while maintaining absolute system stability.</w:t>
+      </w:r>
+    </w:p>
+    <w:p>
+      <w:pPr>
+        <w:pStyle w:val="BodyText"/>
+      </w:pPr>
+      <w:r>
+        <w:t xml:space="preserve">This project has been an incredible masterclass in systems optimization, memory management, and full-stack architecture.</w:t>
+      </w:r>
+    </w:p>
+    <w:p>
+      <w:pPr>
+        <w:pStyle w:val="BodyText"/>
+      </w:pPr>
+      <w:r>
+        <w:t xml:space="preserve">I would love to get your feedback on the live app!</w:t>
+      </w:r>
+    </w:p>
+    <w:p>
+      <w:pPr>
+        <w:pStyle w:val="BodyText"/>
+      </w:pPr>
+      <w:r>
+        <w:t xml:space="preserve">👉</w:t>
+      </w:r>
+      <w:r>
+        <w:t xml:space="preserve"> </w:t>
+      </w:r>
+      <w:r>
+        <w:rPr>
+          <w:b/>
+          <w:bCs/>
+        </w:rPr>
+        <w:t xml:space="preserve">Try it Live on Hugging Face:</w:t>
+      </w:r>
+      <w:r>
+        <w:t xml:space="preserve"> </w:t>
+      </w:r>
+      <w:r>
+        <w:t xml:space="preserve">https://lnkd.in/g2ygb4vM</w:t>
+      </w:r>
+      <w:r>
+        <w:t xml:space="preserve"> </w:t>
+      </w:r>
+      <w:r>
+        <w:t xml:space="preserve">💻</w:t>
+      </w:r>
+      <w:r>
+        <w:t xml:space="preserve"> </w:t>
+      </w:r>
+      <w:r>
+        <w:rPr>
+          <w:b/>
+          <w:bCs/>
+        </w:rPr>
+        <w:t xml:space="preserve">Explore the Code on GitHub:</w:t>
+      </w:r>
+      <w:r>
+        <w:t xml:space="preserve"> </w:t>
+      </w:r>
+      <w:r>
+        <w:t xml:space="preserve">https://lnkd.in/gZa9BHgq</w:t>
+      </w:r>
+      <w:r>
+        <w:t xml:space="preserve"> </w:t>
+      </w:r>
+      <w:r>
+        <w:t xml:space="preserve">📄</w:t>
+      </w:r>
+      <w:r>
+        <w:t xml:space="preserve"> </w:t>
+      </w:r>
+      <w:r>
+        <w:rPr>
+          <w:b/>
+          <w:bCs/>
+        </w:rPr>
+        <w:t xml:space="preserve">Read the Deep-Dive Case Study:</w:t>
+      </w:r>
+      <w:r>
+        <w:t xml:space="preserve"> </w:t>
+      </w:r>
+      <w:r>
+        <w:t xml:space="preserve">https://github.com/BhavyaKansal20/ChromaCrystal_UHD/blob/main/CASE_STUDY.md</w:t>
+      </w:r>
+    </w:p>
+    <w:p>
+      <w:pPr>
+        <w:pStyle w:val="BodyText"/>
+      </w:pPr>
+      <w:r>
+        <w:t xml:space="preserve">To the senior engineers, builders, and recruiters in my network: What would you have optimized differently? I’d love to discuss in the comments below! 👇</w:t>
+      </w:r>
+    </w:p>
+    <w:p>
+      <w:pPr>
+        <w:pStyle w:val="BodyText"/>
+      </w:pPr>
+      <w:r>
+        <w:t xml:space="preserve">#ArtificialIntelligence #MachineLearning #ComputerVision #SoftwareEngineering #NextJS #FastAPI #DeveloperJourney #WebDevelopment #TechInnovation #ThaparUniversity #TIETPatiala #FullStackAI</w:t>
+      </w:r>
+    </w:p>
+    <w:p>
+      <w:r>
+        <w:pict>
+          <v:rect style="width:0;height:1.5pt" o:hralign="center" o:hrstd="t" o:hr="t"/>
+        </w:pict>
+      </w:r>
+    </w:p>
+    <w:bookmarkEnd w:id="11"/>
+    <w:bookmarkStart w:id="12" w:name="Xe5bd9dd0506541fcfa78bd017800ee9ce56add4"/>
     <w:p>
       <w:pPr>
         <w:pStyle w:val="Heading2"/>
@@ -672,8 +847,8 @@
         <w:t xml:space="preserve">Proves that the app is fully interactive, gathers user feedback, and connects to a Google Sheets database.</w:t>
       </w:r>
     </w:p>
-    <w:bookmarkEnd w:id="9"/>
-    <w:bookmarkEnd w:id="10"/>
+    <w:bookmarkEnd w:id="12"/>
+    <w:bookmarkEnd w:id="13"/>
     <w:sectPr>
       <w:footnotePr>
         <w:numRestart w:val="eachSect"/>

</xml_diff>